<commit_message>
Guarda piloto probado: rutas, plantillas, localidad y configuracion Payara
</commit_message>
<xml_diff>
--- a/plantillas-docx/INFORME-INIA.docx
+++ b/plantillas-docx/INFORME-INIA.docx
@@ -861,29 +861,39 @@
   </w:p>
   <w:tbl>
     <w:tblPr>
-      <w:tblW w:type="auto" w:w="0"/>
+      <w:tblW w:type="dxa" w:w="9922"/>
       <w:tblLayout w:type="fixed"/>
       <w:tblLook w:firstColumn="1" w:firstRow="1" w:lastColumn="0" w:lastRow="0" w:noHBand="0" w:noVBand="1" w:val="04A0"/>
+      <w:tblInd w:type="dxa" w:w="0"/>
+      <w:tblCellMar>
+        <w:top w:type="dxa" w:w="40"/>
+        <w:left w:type="dxa" w:w="40"/>
+        <w:bottom w:type="dxa" w:w="40"/>
+        <w:right w:type="dxa" w:w="40"/>
+      </w:tblCellMar>
     </w:tblPr>
     <w:tblGrid>
-      <w:gridCol w:w="5556"/>
-      <w:gridCol w:w="2098"/>
-      <w:gridCol w:w="283"/>
-      <w:gridCol w:w="1984"/>
+      <w:gridCol w:w="4200"/>
+      <w:gridCol w:w="1200"/>
+      <w:gridCol w:w="1800"/>
+      <w:gridCol w:w="200"/>
+      <w:gridCol w:w="2522"/>
     </w:tblGrid>
     <w:tr>
       <w:tc>
         <w:tcPr>
-          <w:tcW w:type="dxa" w:w="5556"/>
+          <w:tcW w:type="dxa" w:w="4200"/>
+          <w:vAlign w:val="center"/>
         </w:tcPr>
         <w:p>
           <w:pPr>
-            <w:spacing w:after="0" w:before="0"/>
+            <w:spacing w:after="0" w:before="0" w:line="200" w:lineRule="auto"/>
+            <w:ind w:left="0" w:right="0" w:firstLine="0"/>
           </w:pPr>
           <w:r>
             <w:drawing>
               <wp:inline xmlns:a="http://schemas.openxmlformats.org/drawingml/2006/main" xmlns:pic="http://schemas.openxmlformats.org/drawingml/2006/picture">
-                <wp:extent cx="3456000" cy="435988"/>
+                <wp:extent cx="2603500" cy="328442"/>
                 <wp:docPr id="1" name="Picture 1"/>
                 <wp:cNvGraphicFramePr>
                   <a:graphicFrameLocks noChangeAspect="1"/>
@@ -904,7 +914,7 @@
                       <pic:spPr>
                         <a:xfrm>
                           <a:off x="0" y="0"/>
-                          <a:ext cx="3456000" cy="435988"/>
+                          <a:ext cx="2603500" cy="328442"/>
                         </a:xfrm>
                         <a:prstGeom prst="rect"/>
                       </pic:spPr>
@@ -918,48 +928,18 @@
       </w:tc>
       <w:tc>
         <w:tcPr>
-          <w:tcW w:type="dxa" w:w="2098"/>
-          <w:shd w:fill="BFBFBF"/>
+          <w:tcW w:type="dxa" w:w="1200"/>
+          <w:vAlign w:val="center"/>
         </w:tcPr>
         <w:p>
           <w:pPr>
-            <w:spacing w:after="0" w:before="0"/>
-          </w:pPr>
-          <w:fldSimple w:instr=" MERGEFIELD ${DEPENDENCIA_TITULO} \* MERGEFORMAT ">
-            <w:r>
-              <w:rPr>
-                <w:rFonts w:ascii="Arial" w:hAnsi="Arial"/>
-                <w:b w:val="0"/>
-                <w:color w:val="FFFFFF"/>
-                <w:sz w:val="14"/>
-              </w:rPr>
-              <w:t>«DEPENDENCIA TITULO»</w:t>
-            </w:r>
-          </w:fldSimple>
-        </w:p>
-      </w:tc>
-      <w:tc>
-        <w:tcPr>
-          <w:tcW w:type="dxa" w:w="283"/>
-        </w:tcPr>
-        <w:p>
-          <w:pPr>
-            <w:spacing w:after="0" w:before="0"/>
-          </w:pPr>
-        </w:p>
-      </w:tc>
-      <w:tc>
-        <w:tcPr>
-          <w:tcW w:type="dxa" w:w="1984"/>
-        </w:tcPr>
-        <w:p>
-          <w:pPr>
-            <w:spacing w:after="0" w:before="0"/>
+            <w:spacing w:after="0" w:before="0" w:line="200" w:lineRule="auto"/>
+            <w:ind w:left="0" w:right="0" w:firstLine="0"/>
           </w:pPr>
           <w:r>
             <w:drawing>
               <wp:inline xmlns:a="http://schemas.openxmlformats.org/drawingml/2006/main" xmlns:pic="http://schemas.openxmlformats.org/drawingml/2006/picture">
-                <wp:extent cx="1116000" cy="336829"/>
+                <wp:extent cx="698500" cy="210820"/>
                 <wp:docPr id="2" name="Picture 2"/>
                 <wp:cNvGraphicFramePr>
                   <a:graphicFrameLocks noChangeAspect="1"/>
@@ -980,7 +960,7 @@
                       <pic:spPr>
                         <a:xfrm>
                           <a:off x="0" y="0"/>
-                          <a:ext cx="1116000" cy="336829"/>
+                          <a:ext cx="698500" cy="210820"/>
                         </a:xfrm>
                         <a:prstGeom prst="rect"/>
                       </pic:spPr>
@@ -990,6 +970,54 @@
               </wp:inline>
             </w:drawing>
           </w:r>
+        </w:p>
+      </w:tc>
+      <w:tc>
+        <w:tcPr>
+          <w:tcW w:type="dxa" w:w="1800"/>
+          <w:shd w:fill="BFBFBF"/>
+          <w:vAlign w:val="center"/>
+        </w:tcPr>
+        <w:p>
+          <w:pPr>
+            <w:spacing w:after="0" w:before="0" w:line="200" w:lineRule="auto"/>
+            <w:ind w:left="0" w:right="0" w:firstLine="0"/>
+          </w:pPr>
+          <w:fldSimple w:instr=" MERGEFIELD ${DEPENDENCIA_TITULO} \* MERGEFORMAT ">
+            <w:r>
+              <w:rPr>
+                <w:rFonts w:ascii="Arial" w:hAnsi="Arial"/>
+                <w:b w:val="0"/>
+                <w:color w:val="FFFFFF"/>
+                <w:sz w:val="15"/>
+              </w:rPr>
+              <w:t>«DEPENDENCIA TITULO»</w:t>
+            </w:r>
+          </w:fldSimple>
+        </w:p>
+      </w:tc>
+      <w:tc>
+        <w:tcPr>
+          <w:tcW w:type="dxa" w:w="200"/>
+          <w:vAlign w:val="center"/>
+        </w:tcPr>
+        <w:p>
+          <w:pPr>
+            <w:spacing w:after="0" w:before="0" w:line="200" w:lineRule="auto"/>
+            <w:ind w:left="0" w:right="0" w:firstLine="0"/>
+          </w:pPr>
+        </w:p>
+      </w:tc>
+      <w:tc>
+        <w:tcPr>
+          <w:tcW w:type="dxa" w:w="2522"/>
+          <w:vAlign w:val="center"/>
+        </w:tcPr>
+        <w:p>
+          <w:pPr>
+            <w:spacing w:after="0" w:before="0" w:line="200" w:lineRule="auto"/>
+            <w:ind w:left="0" w:right="0" w:firstLine="0"/>
+          </w:pPr>
         </w:p>
       </w:tc>
     </w:tr>

</xml_diff>